<commit_message>
Intro: intégrer voyelles_IPA.svg après le tableau voyelles
Le SVG (1100×640px) est placé entre le tableau VOWEL_TABLE_ROWS
et la note sur /i/ >2600 Hz. Lien relatif depuis le dossier media/,
avec figcaption. Fichier SVG ajouté dans media/.
</commit_message>
<xml_diff>
--- a/Versions-html-and-docx/section_intro_v4.docx
+++ b/Versions-html-and-docx/section_intro_v4.docx
@@ -440,7 +440,7 @@
                 <w:b w:val="0"/>
                 <w:sz w:val="18"/>
               </w:rPr>
-              <w:t>Studio On Line / Orchestre de Lyon</w:t>
+              <w:t>Studio On Line</w:t>
             </w:r>
           </w:p>
         </w:tc>
@@ -476,7 +476,7 @@
                 <w:b w:val="0"/>
                 <w:sz w:val="18"/>
               </w:rPr>
-              <w:t>IRCAM / Orchestre de Lyon</w:t>
+              <w:t>IRCAM / EIC</w:t>
             </w:r>
           </w:p>
         </w:tc>
@@ -514,7 +514,7 @@
                 <w:b w:val="0"/>
                 <w:sz w:val="18"/>
               </w:rPr>
-              <w:t>Extension personnelle</w:t>
+              <w:t>Ajouts de provenances diverses</w:t>
             </w:r>
           </w:p>
         </w:tc>
@@ -550,7 +550,7 @@
                 <w:b w:val="0"/>
                 <w:sz w:val="18"/>
               </w:rPr>
-              <w:t>Analyse propre</w:t>
+              <w:t>VSL, Con Timbre, échantillons personnels</w:t>
             </w:r>
           </w:p>
         </w:tc>
@@ -1657,10 +1657,11 @@
         <w:tblLook w:firstColumn="1" w:firstRow="1" w:lastColumn="0" w:lastRow="0" w:noHBand="0" w:noVBand="1" w:val="04A0"/>
       </w:tblPr>
       <w:tblGrid>
-        <w:gridCol w:w="2422"/>
-        <w:gridCol w:w="2422"/>
-        <w:gridCol w:w="2422"/>
-        <w:gridCol w:w="2422"/>
+        <w:gridCol w:w="1938"/>
+        <w:gridCol w:w="1938"/>
+        <w:gridCol w:w="1938"/>
+        <w:gridCol w:w="1938"/>
+        <w:gridCol w:w="1938"/>
       </w:tblGrid>
       <w:tr>
         <w:tc>
@@ -1705,6 +1706,26 @@
         </w:tc>
         <w:tc>
           <w:tcPr>
+            <w:tcW w:type="dxa" w:w="1984"/>
+            <w:shd w:fill="4A148C"/>
+          </w:tcPr>
+          <w:p>
+            <w:pPr>
+              <w:jc w:val="center"/>
+            </w:pPr>
+            <w:r/>
+            <w:r>
+              <w:rPr>
+                <w:b/>
+                <w:color w:val="FFFFFF"/>
+                <w:sz w:val="18"/>
+              </w:rPr>
+              <w:t>Exemples français</w:t>
+            </w:r>
+          </w:p>
+        </w:tc>
+        <w:tc>
+          <w:tcPr>
             <w:tcW w:type="dxa" w:w="1417"/>
             <w:shd w:fill="4A148C"/>
           </w:tcPr>
@@ -1725,7 +1746,7 @@
         </w:tc>
         <w:tc>
           <w:tcPr>
-            <w:tcW w:type="dxa" w:w="5783"/>
+            <w:tcW w:type="dxa" w:w="4819"/>
             <w:shd w:fill="4A148C"/>
           </w:tcPr>
           <w:p>
@@ -1783,6 +1804,24 @@
         </w:tc>
         <w:tc>
           <w:tcPr>
+            <w:tcW w:type="dxa" w:w="1984"/>
+          </w:tcPr>
+          <w:p>
+            <w:pPr>
+              <w:jc w:val="left"/>
+            </w:pPr>
+            <w:r/>
+            <w:r>
+              <w:rPr>
+                <w:b w:val="0"/>
+                <w:sz w:val="18"/>
+              </w:rPr>
+              <w:t>bouche, tour, lune</w:t>
+            </w:r>
+          </w:p>
+        </w:tc>
+        <w:tc>
+          <w:tcPr>
             <w:tcW w:type="dxa" w:w="1417"/>
           </w:tcPr>
           <w:p>
@@ -1801,7 +1840,7 @@
         </w:tc>
         <w:tc>
           <w:tcPr>
-            <w:tcW w:type="dxa" w:w="5783"/>
+            <w:tcW w:type="dxa" w:w="4819"/>
           </w:tcPr>
           <w:p>
             <w:pPr>
@@ -1813,7 +1852,7 @@
                 <w:b w:val="0"/>
                 <w:sz w:val="18"/>
               </w:rPr>
-              <w:t>Tuba basse (249), Contrebasse (200), Contrebasson (226), Flûte basse (301)</w:t>
+              <w:t>Contrebasse (172), Tuba basse (226), Tuba CB (226), Contrebasson (226), Trombone (237), Flûte basse (301)</w:t>
             </w:r>
           </w:p>
         </w:tc>
@@ -1857,6 +1896,24 @@
         </w:tc>
         <w:tc>
           <w:tcPr>
+            <w:tcW w:type="dxa" w:w="1984"/>
+          </w:tcPr>
+          <w:p>
+            <w:pPr>
+              <w:jc w:val="left"/>
+            </w:pPr>
+            <w:r/>
+            <w:r>
+              <w:rPr>
+                <w:b w:val="0"/>
+                <w:sz w:val="18"/>
+              </w:rPr>
+              <w:t>beau, sol, voix</w:t>
+            </w:r>
+          </w:p>
+        </w:tc>
+        <w:tc>
+          <w:tcPr>
             <w:tcW w:type="dxa" w:w="1417"/>
           </w:tcPr>
           <w:p>
@@ -1875,7 +1932,7 @@
         </w:tc>
         <w:tc>
           <w:tcPr>
-            <w:tcW w:type="dxa" w:w="5783"/>
+            <w:tcW w:type="dxa" w:w="4819"/>
           </w:tcPr>
           <w:p>
             <w:pPr>
@@ -1887,7 +1944,7 @@
                 <w:b w:val="0"/>
                 <w:sz w:val="18"/>
               </w:rPr>
-              <w:t>Cor (457), Tuba contrebasse (471), Contrebasson (478), Trombone (491), Violoncelle (499), Basson (502), Cor anglais (452), Vcl-Ens (587)</w:t>
+              <w:t>Alto (377), Cor (388), Sax alto (398), Cor anglais (452), Cl. Sib (463), Basson (495), Ens. Violons (495), Violon (506)</w:t>
             </w:r>
           </w:p>
         </w:tc>
@@ -1931,6 +1988,24 @@
         </w:tc>
         <w:tc>
           <w:tcPr>
+            <w:tcW w:type="dxa" w:w="1984"/>
+          </w:tcPr>
+          <w:p>
+            <w:pPr>
+              <w:jc w:val="left"/>
+            </w:pPr>
+            <w:r/>
+            <w:r>
+              <w:rPr>
+                <w:b w:val="0"/>
+                <w:sz w:val="18"/>
+              </w:rPr>
+              <w:t>pâte, âme, (entre o et a)</w:t>
+            </w:r>
+          </w:p>
+        </w:tc>
+        <w:tc>
+          <w:tcPr>
             <w:tcW w:type="dxa" w:w="1417"/>
           </w:tcPr>
           <w:p>
@@ -1949,7 +2024,7 @@
         </w:tc>
         <w:tc>
           <w:tcPr>
-            <w:tcW w:type="dxa" w:w="5783"/>
+            <w:tcW w:type="dxa" w:w="4819"/>
           </w:tcPr>
           <w:p>
             <w:pPr>
@@ -1961,7 +2036,7 @@
                 <w:b w:val="0"/>
                 <w:sz w:val="18"/>
               </w:rPr>
-              <w:t>Vcl-Ens sourdine (587), Alto sourdine (683), Flûte basse (737)</w:t>
+              <w:t>Cl. Mib (678), Flûte (743), Hautbois (743), Trompette (786)</w:t>
             </w:r>
           </w:p>
         </w:tc>
@@ -2005,6 +2080,24 @@
         </w:tc>
         <w:tc>
           <w:tcPr>
+            <w:tcW w:type="dxa" w:w="1984"/>
+          </w:tcPr>
+          <w:p>
+            <w:pPr>
+              <w:jc w:val="left"/>
+            </w:pPr>
+            <w:r/>
+            <w:r>
+              <w:rPr>
+                <w:b w:val="0"/>
+                <w:sz w:val="18"/>
+              </w:rPr>
+              <w:t>pas, classe, chant</w:t>
+            </w:r>
+          </w:p>
+        </w:tc>
+        <w:tc>
+          <w:tcPr>
             <w:tcW w:type="dxa" w:w="1417"/>
           </w:tcPr>
           <w:p>
@@ -2023,7 +2116,7 @@
         </w:tc>
         <w:tc>
           <w:tcPr>
-            <w:tcW w:type="dxa" w:w="5783"/>
+            <w:tcW w:type="dxa" w:w="4819"/>
           </w:tcPr>
           <w:p>
             <w:pPr>
@@ -2035,7 +2128,7 @@
                 <w:b w:val="0"/>
                 <w:sz w:val="18"/>
               </w:rPr>
-              <w:t>Trb. basse (894), Cl. basse (909), Cl. Sib (1 016), Cor anglais Fp (1 135), Trompette (1 046, Fp), Alto-Ens (1 190), Basson Fp (1 079)</w:t>
+              <w:t>Cor Fp (738), Violon Fp (893), Basson Fp (1 079), Trompette Fp (1 046), Cor anglais Fp (1 135)</w:t>
             </w:r>
           </w:p>
         </w:tc>
@@ -2079,6 +2172,24 @@
         </w:tc>
         <w:tc>
           <w:tcPr>
+            <w:tcW w:type="dxa" w:w="1984"/>
+          </w:tcPr>
+          <w:p>
+            <w:pPr>
+              <w:jc w:val="left"/>
+            </w:pPr>
+            <w:r/>
+            <w:r>
+              <w:rPr>
+                <w:b w:val="0"/>
+                <w:sz w:val="18"/>
+              </w:rPr>
+              <w:t>fée, étoile, regard</w:t>
+            </w:r>
+          </w:p>
+        </w:tc>
+        <w:tc>
+          <w:tcPr>
             <w:tcW w:type="dxa" w:w="1417"/>
           </w:tcPr>
           <w:p>
@@ -2097,7 +2208,7 @@
         </w:tc>
         <w:tc>
           <w:tcPr>
-            <w:tcW w:type="dxa" w:w="5783"/>
+            <w:tcW w:type="dxa" w:w="4819"/>
           </w:tcPr>
           <w:p>
             <w:pPr>
@@ -2109,7 +2220,7 @@
                 <w:b w:val="0"/>
                 <w:sz w:val="18"/>
               </w:rPr>
-              <w:t>Flûte (1 354), Hautbois (1 460), Vln-Ens (1 556), Cl. Mib (1 747), Piccolo (2 336), Violon Fp (893)</w:t>
+              <w:t>Cl. Sib Fp (1 412), Flûte Fp (1 535), Hautbois Fp (1 485), Cl. Mib Fp (1 266), Petite flûte (1 109)</w:t>
             </w:r>
           </w:p>
         </w:tc>
@@ -2153,6 +2264,24 @@
         </w:tc>
         <w:tc>
           <w:tcPr>
+            <w:tcW w:type="dxa" w:w="1984"/>
+          </w:tcPr>
+          <w:p>
+            <w:pPr>
+              <w:jc w:val="left"/>
+            </w:pPr>
+            <w:r/>
+            <w:r>
+              <w:rPr>
+                <w:b w:val="0"/>
+                <w:sz w:val="18"/>
+              </w:rPr>
+              <w:t>vie, siffler, ici</w:t>
+            </w:r>
+          </w:p>
+        </w:tc>
+        <w:tc>
+          <w:tcPr>
             <w:tcW w:type="dxa" w:w="1417"/>
           </w:tcPr>
           <w:p>
@@ -2171,7 +2300,7 @@
         </w:tc>
         <w:tc>
           <w:tcPr>
-            <w:tcW w:type="dxa" w:w="5783"/>
+            <w:tcW w:type="dxa" w:w="4819"/>
           </w:tcPr>
           <w:p>
             <w:pPr>
@@ -2183,7 +2312,7 @@
                 <w:b w:val="0"/>
                 <w:sz w:val="18"/>
               </w:rPr>
-              <w:t>Petite flûte (2 336 ≈ limite), Trompette+sourdine harmon (2 358)</w:t>
+              <w:t>Petite flûte (1 992 F2), Trompette+sourdine harmon (2 358)</w:t>
             </w:r>
           </w:p>
         </w:tc>

</xml_diff>